<commit_message>
Nudge A on placement/mentoring asks; move deep-dive methods to Buddies.
Participant B packs keep foundation only; DB-3/DB-4 recipes live in Buddy Guide and Data Task Solutions for coaching when requests arrive.

Co-authored-by: Cursor <cursoragent@cursor.com>
</commit_message>
<xml_diff>
--- a/Facilitators/Word/02_Buddy_Guide.docx
+++ b/Facilitators/Word/02_Buddy_Guide.docx
@@ -320,6 +320,102 @@
           <w:rFonts w:ascii="Lexend" w:hAnsi="Lexend" w:eastAsia="Lexend" w:cs="Lexend"/>
           <w:color w:val="1B2A4A"/>
         </w:rPr>
+        <w:t>Drivers of placement / attendance</w:t>
+      </w:r>
+    </w:p>
+    <w:p>
+      <w:pPr>
+        <w:pStyle w:val="ListNumber"/>
+        <w:ind w:left="360"/>
+      </w:pPr>
+      <w:r>
+        <w:rPr>
+          <w:rFonts w:ascii="Nunito" w:hAnsi="Nunito" w:eastAsia="Nunito" w:cs="Nunito"/>
+        </w:rPr>
+        <w:t>Level 1: Staff and young people talk about what helps someone get a job - have you tested any of that?</w:t>
+      </w:r>
+    </w:p>
+    <w:p>
+      <w:pPr>
+        <w:pStyle w:val="ListNumber"/>
+        <w:ind w:left="360"/>
+      </w:pPr>
+      <w:r>
+        <w:rPr>
+          <w:rFonts w:ascii="Nunito" w:hAnsi="Nunito" w:eastAsia="Nunito" w:cs="Nunito"/>
+        </w:rPr>
+        <w:t>Level 2: Would attendance or programme design change your recommendation if the data disagreed?</w:t>
+      </w:r>
+    </w:p>
+    <w:p>
+      <w:pPr>
+        <w:pStyle w:val="ListNumber"/>
+        <w:ind w:left="360"/>
+      </w:pPr>
+      <w:r>
+        <w:rPr>
+          <w:rFonts w:ascii="Nunito" w:hAnsi="Nunito" w:eastAsia="Nunito" w:cs="Nunito"/>
+        </w:rPr>
+        <w:t>Level 3: Nudge A toward a request on placement drivers; then coach B on joining tables without giving the steps.</w:t>
+      </w:r>
+    </w:p>
+    <w:p>
+      <w:pPr>
+        <w:pStyle w:val="Heading2"/>
+      </w:pPr>
+      <w:r>
+        <w:rPr>
+          <w:rFonts w:ascii="Lexend" w:hAnsi="Lexend" w:eastAsia="Lexend" w:cs="Lexend"/>
+          <w:color w:val="1B2A4A"/>
+        </w:rPr>
+        <w:t>Mentoring / completion / volunteers</w:t>
+      </w:r>
+    </w:p>
+    <w:p>
+      <w:pPr>
+        <w:pStyle w:val="ListNumber"/>
+        <w:ind w:left="360"/>
+      </w:pPr>
+      <w:r>
+        <w:rPr>
+          <w:rFonts w:ascii="Nunito" w:hAnsi="Nunito" w:eastAsia="Nunito" w:cs="Nunito"/>
+        </w:rPr>
+        <w:t>Level 1: Transcripts mention mentoring and drop-out - is that a claim or an evidence gap?</w:t>
+      </w:r>
+    </w:p>
+    <w:p>
+      <w:pPr>
+        <w:pStyle w:val="ListNumber"/>
+        <w:ind w:left="360"/>
+      </w:pPr>
+      <w:r>
+        <w:rPr>
+          <w:rFonts w:ascii="Nunito" w:hAnsi="Nunito" w:eastAsia="Nunito" w:cs="Nunito"/>
+        </w:rPr>
+        <w:t>Level 2: What would you ask B if mentoring intensity mattered for your option?</w:t>
+      </w:r>
+    </w:p>
+    <w:p>
+      <w:pPr>
+        <w:pStyle w:val="ListNumber"/>
+        <w:ind w:left="360"/>
+      </w:pPr>
+      <w:r>
+        <w:rPr>
+          <w:rFonts w:ascii="Nunito" w:hAnsi="Nunito" w:eastAsia="Nunito" w:cs="Nunito"/>
+        </w:rPr>
+        <w:t>Level 3: If B is stuck: which tables mention mentors or completion? What would you exclude before averaging?</w:t>
+      </w:r>
+    </w:p>
+    <w:p>
+      <w:pPr>
+        <w:pStyle w:val="Heading2"/>
+      </w:pPr>
+      <w:r>
+        <w:rPr>
+          <w:rFonts w:ascii="Lexend" w:hAnsi="Lexend" w:eastAsia="Lexend" w:cs="Lexend"/>
+          <w:color w:val="1B2A4A"/>
+        </w:rPr>
         <w:t>Placement rate</w:t>
       </w:r>
     </w:p>
@@ -464,6 +560,93 @@
           <w:rFonts w:ascii="Lexend" w:hAnsi="Lexend" w:eastAsia="Lexend" w:cs="Lexend"/>
           <w:color w:val="1B2A4A"/>
         </w:rPr>
+        <w:t>Coaching B on deep-dive requests (staff only)</w:t>
+      </w:r>
+    </w:p>
+    <w:p>
+      <w:pPr>
+        <w:spacing w:after="120"/>
+      </w:pPr>
+      <w:r>
+        <w:rPr>
+          <w:rFonts w:ascii="Nunito" w:hAnsi="Nunito" w:eastAsia="Nunito" w:cs="Nunito"/>
+          <w:b w:val="0"/>
+          <w:i w:val="0"/>
+          <w:color w:val="222222"/>
+          <w:sz w:val="22"/>
+        </w:rPr>
+        <w:t>Participant packs no longer prescribe DB-3/DB-4 methods. When B receives a request about attendance, placement drivers, mentoring or completion:</w:t>
+      </w:r>
+    </w:p>
+    <w:p>
+      <w:pPr>
+        <w:pStyle w:val="ListNumber"/>
+        <w:ind w:left="360"/>
+      </w:pPr>
+      <w:r>
+        <w:rPr>
+          <w:rFonts w:ascii="Nunito" w:hAnsi="Nunito" w:eastAsia="Nunito" w:cs="Nunito"/>
+        </w:rPr>
+        <w:t>Ask them to restate A's decision question in one sentence.</w:t>
+      </w:r>
+    </w:p>
+    <w:p>
+      <w:pPr>
+        <w:pStyle w:val="ListNumber"/>
+        <w:ind w:left="360"/>
+      </w:pPr>
+      <w:r>
+        <w:rPr>
+          <w:rFonts w:ascii="Nunito" w:hAnsi="Nunito" w:eastAsia="Nunito" w:cs="Nunito"/>
+        </w:rPr>
+        <w:t>Ask which tables in the data dictionary look relevant - do not name the join path first.</w:t>
+      </w:r>
+    </w:p>
+    <w:p>
+      <w:pPr>
+        <w:pStyle w:val="ListNumber"/>
+        <w:ind w:left="360"/>
+      </w:pPr>
+      <w:r>
+        <w:rPr>
+          <w:rFonts w:ascii="Nunito" w:hAnsi="Nunito" w:eastAsia="Nunito" w:cs="Nunito"/>
+        </w:rPr>
+        <w:t>If still stuck, Level 2: 'How would you get one attendance rate per young person?' or 'What would you do with hours logged against inactive mentors?'</w:t>
+      </w:r>
+    </w:p>
+    <w:p>
+      <w:pPr>
+        <w:pStyle w:val="ListNumber"/>
+        <w:ind w:left="360"/>
+      </w:pPr>
+      <w:r>
+        <w:rPr>
+          <w:rFonts w:ascii="Nunito" w:hAnsi="Nunito" w:eastAsia="Nunito" w:cs="Nunito"/>
+        </w:rPr>
+        <w:t>Level 3 (last resort): point them to Facilitators/05_Data_Task_Solutions for method hints - do not read the expected findings aloud.</w:t>
+      </w:r>
+    </w:p>
+    <w:p>
+      <w:pPr>
+        <w:pStyle w:val="ListNumber"/>
+        <w:ind w:left="360"/>
+      </w:pPr>
+      <w:r>
+        <w:rPr>
+          <w:rFonts w:ascii="Nunito" w:hAnsi="Nunito" w:eastAsia="Nunito" w:cs="Nunito"/>
+        </w:rPr>
+        <w:t>Always push: association is not causation; name confounders in the Findings Memo.</w:t>
+      </w:r>
+    </w:p>
+    <w:p>
+      <w:pPr>
+        <w:pStyle w:val="Heading1"/>
+      </w:pPr>
+      <w:r>
+        <w:rPr>
+          <w:rFonts w:ascii="Lexend" w:hAnsi="Lexend" w:eastAsia="Lexend" w:cs="Lexend"/>
+          <w:color w:val="1B2A4A"/>
+        </w:rPr>
         <w:t>Check-in schedule</w:t>
       </w:r>
     </w:p>
@@ -479,7 +662,7 @@
           <w:color w:val="222222"/>
           <w:sz w:val="22"/>
         </w:rPr>
-        <w:t>Fridays of Weeks 1-5. Fifteen minutes. Review Request Log health, Findings Memo quality, and whether claims are cited. Do not review answers for correctness. Do not give A the dataset.</w:t>
+        <w:t>Fridays of Weeks 1-7. Fifteen minutes. Review Request Log health, Findings Memo quality, and whether claims are cited. Do not review answers for correctness. Do not give A the dataset. From Week 3, check whether A has asked at least one driver/mentoring question if their options depend on it.</w:t>
       </w:r>
     </w:p>
     <w:p>
@@ -528,6 +711,18 @@
           <w:rFonts w:ascii="Nunito" w:hAnsi="Nunito" w:eastAsia="Nunito" w:cs="Nunito"/>
         </w:rPr>
         <w:t>B sharing the raw workbook or answering questions A never asked.</w:t>
+      </w:r>
+    </w:p>
+    <w:p>
+      <w:pPr>
+        <w:pStyle w:val="ListBullet"/>
+        <w:ind w:left="360"/>
+      </w:pPr>
+      <w:r>
+        <w:rPr>
+          <w:rFonts w:ascii="Nunito" w:hAnsi="Nunito" w:eastAsia="Nunito" w:cs="Nunito"/>
+        </w:rPr>
+        <w:t>A never asking about attendance, mentoring or completion despite transcript clues.</w:t>
       </w:r>
     </w:p>
     <w:p>

</xml_diff>

<commit_message>
Move ask themes to Buddy coaching; require A_B_Exchange record.
Participant briefs no longer list placement/mentoring menus; Buddies nudge discovery. Strengthen Request/Findings templates and mandate saving official A–B PDFs for assessment.

Co-authored-by: Cursor <cursoragent@cursor.com>
</commit_message>
<xml_diff>
--- a/Facilitators/Word/02_Buddy_Guide.docx
+++ b/Facilitators/Word/02_Buddy_Guide.docx
@@ -212,6 +212,84 @@
           <w:rFonts w:ascii="Lexend" w:hAnsi="Lexend" w:eastAsia="Lexend" w:cs="Lexend"/>
           <w:color w:val="1B2A4A"/>
         </w:rPr>
+        <w:t>Staff-only: question themes (do not paste into participant packs)</w:t>
+      </w:r>
+    </w:p>
+    <w:p>
+      <w:pPr>
+        <w:spacing w:after="120"/>
+      </w:pPr>
+      <w:r>
+        <w:rPr>
+          <w:rFonts w:ascii="Nunito" w:hAnsi="Nunito" w:eastAsia="Nunito" w:cs="Nunito"/>
+          <w:b w:val="0"/>
+          <w:i w:val="0"/>
+          <w:color w:val="222222"/>
+          <w:sz w:val="22"/>
+        </w:rPr>
+        <w:t>Participants should invent asks from transcripts and their issue tree. If they only request vanity metrics from D-01, nudge - do not hand them a menu. Useful pressure-tests often include:</w:t>
+      </w:r>
+    </w:p>
+    <w:p>
+      <w:pPr>
+        <w:pStyle w:val="ListBullet"/>
+        <w:ind w:left="360"/>
+      </w:pPr>
+      <w:r>
+        <w:rPr>
+          <w:rFonts w:ascii="Nunito" w:hAnsi="Nunito" w:eastAsia="Nunito" w:cs="Nunito"/>
+        </w:rPr>
+        <w:t>What actually moves placement (attendance, programme design, or something else)?</w:t>
+      </w:r>
+    </w:p>
+    <w:p>
+      <w:pPr>
+        <w:pStyle w:val="ListBullet"/>
+        <w:ind w:left="360"/>
+      </w:pPr>
+      <w:r>
+        <w:rPr>
+          <w:rFonts w:ascii="Nunito" w:hAnsi="Nunito" w:eastAsia="Nunito" w:cs="Nunito"/>
+        </w:rPr>
+        <w:t>Whether mentoring intensity, completion or volunteer capacity matches how staff and young people describe it.</w:t>
+      </w:r>
+    </w:p>
+    <w:p>
+      <w:pPr>
+        <w:pStyle w:val="ListBullet"/>
+        <w:ind w:left="360"/>
+      </w:pPr>
+      <w:r>
+        <w:rPr>
+          <w:rFonts w:ascii="Nunito" w:hAnsi="Nunito" w:eastAsia="Nunito" w:cs="Nunito"/>
+        </w:rPr>
+        <w:t>Ask only what would change the recommendation - not everything.</w:t>
+      </w:r>
+    </w:p>
+    <w:p>
+      <w:pPr>
+        <w:spacing w:after="120"/>
+      </w:pPr>
+      <w:r>
+        <w:rPr>
+          <w:rFonts w:ascii="Nunito" w:hAnsi="Nunito" w:eastAsia="Nunito" w:cs="Nunito"/>
+          <w:b w:val="0"/>
+          <w:i w:val="0"/>
+          <w:color w:val="222222"/>
+          <w:sz w:val="22"/>
+        </w:rPr>
+        <w:t>These themes live here so Buddies can guide discovery. They were removed from Workflow A's brief so teams are not spoon-fed the analysis agenda.</w:t>
+      </w:r>
+    </w:p>
+    <w:p>
+      <w:pPr>
+        <w:pStyle w:val="Heading1"/>
+      </w:pPr>
+      <w:r>
+        <w:rPr>
+          <w:rFonts w:ascii="Lexend" w:hAnsi="Lexend" w:eastAsia="Lexend" w:cs="Lexend"/>
+          <w:color w:val="1B2A4A"/>
+        </w:rPr>
         <w:t>The hint ladder</w:t>
       </w:r>
     </w:p>
@@ -405,6 +483,54 @@
           <w:rFonts w:ascii="Nunito" w:hAnsi="Nunito" w:eastAsia="Nunito" w:cs="Nunito"/>
         </w:rPr>
         <w:t>Level 3: If B is stuck: which tables mention mentors or completion? What would you exclude before averaging?</w:t>
+      </w:r>
+    </w:p>
+    <w:p>
+      <w:pPr>
+        <w:pStyle w:val="Heading2"/>
+      </w:pPr>
+      <w:r>
+        <w:rPr>
+          <w:rFonts w:ascii="Lexend" w:hAnsi="Lexend" w:eastAsia="Lexend" w:cs="Lexend"/>
+          <w:color w:val="1B2A4A"/>
+        </w:rPr>
+        <w:t>A_B_Exchange hygiene</w:t>
+      </w:r>
+    </w:p>
+    <w:p>
+      <w:pPr>
+        <w:pStyle w:val="ListNumber"/>
+        <w:ind w:left="360"/>
+      </w:pPr>
+      <w:r>
+        <w:rPr>
+          <w:rFonts w:ascii="Nunito" w:hAnsi="Nunito" w:eastAsia="Nunito" w:cs="Nunito"/>
+        </w:rPr>
+        <w:t>Level 1: Where is the PDF of that request?</w:t>
+      </w:r>
+    </w:p>
+    <w:p>
+      <w:pPr>
+        <w:pStyle w:val="ListNumber"/>
+        <w:ind w:left="360"/>
+      </w:pPr>
+      <w:r>
+        <w:rPr>
+          <w:rFonts w:ascii="Nunito" w:hAnsi="Nunito" w:eastAsia="Nunito" w:cs="Nunito"/>
+        </w:rPr>
+        <w:t>Level 2: Is the Findings Memo in A_B_Exchange/ or only in a chat thread?</w:t>
+      </w:r>
+    </w:p>
+    <w:p>
+      <w:pPr>
+        <w:pStyle w:val="ListNumber"/>
+        <w:ind w:left="360"/>
+      </w:pPr>
+      <w:r>
+        <w:rPr>
+          <w:rFonts w:ascii="Nunito" w:hAnsi="Nunito" w:eastAsia="Nunito" w:cs="Nunito"/>
+        </w:rPr>
+        <w:t>Level 3: Refuse to treat chat as the official record; require R-xx / FM-xx PDFs before handoff.</w:t>
       </w:r>
     </w:p>
     <w:p>

</xml_diff>